<commit_message>
Two-step heart disease screening: pipeline, app, tests, results and paper
</commit_message>
<xml_diff>
--- a/paper/HeartDisease_TwoStep_Screening_Paper.docx
+++ b/paper/HeartDisease_TwoStep_Screening_Paper.docx
@@ -12187,6 +12187,94 @@
         </w:tc>
       </w:tr>
     </w:tbl>
+    <w:p>
+      <w:pPr>
+        <w:pStyle w:val="Heading2"/>
+        <w:keepNext/>
+        <w:spacing w:after="0" w:before="190"/>
+      </w:pPr>
+      <w:r>
+        <w:t xml:space="preserve">5.6 Web application</w:t>
+      </w:r>
+    </w:p>
+    <w:p>
+      <w:pPr>
+        <w:spacing w:after="0" w:before="0"/>
+        <w:jc w:val="both"/>
+      </w:pPr>
+      <w:r>
+        <w:t xml:space="preserve">The system is available as a web application at https://two-step-heart-screening.streamlit.app/, built with Streamlit from the code in the submitted archive. Fig. 5 shows it on a phone-sized screen, the setting of a basic clinic. Each screen asks only for the inputs of its step, rejects values outside plausible ranges, and returns Low risk, High risk or Not sure with a plain instruction. It also shows the estimated risk at the chosen prevalence and, at Step 1, the share of sick patients that cross-validation sent home. The sidebar sets the assumed prevalence and the Step 1 safety level, and cholesterol can be marked as not measured at Step 2. The values in the figure are the form’s default example values, not a real patient. The application carries the warning that it is a research prototype and not for clinical use.</w:t>
+      </w:r>
+    </w:p>
+    <w:p>
+      <w:pPr>
+        <w:keepNext/>
+        <w:spacing w:after="0" w:before="60" w:line="240" w:lineRule="auto"/>
+        <w:jc w:val="center"/>
+      </w:pPr>
+      <w:r>
+        <w:drawing>
+          <wp:inline distT="0" distB="0" distL="0" distR="0">
+            <wp:extent cx="5210175" cy="3467100"/>
+            <wp:effectExtent t="0" r="0" b="0" l="0"/>
+            <wp:docPr id="1" name="" descr="" title=""/>
+            <wp:cNvGraphicFramePr>
+              <a:graphicFrameLocks xmlns:a="http://schemas.openxmlformats.org/drawingml/2006/main" noChangeAspect="1"/>
+            </wp:cNvGraphicFramePr>
+            <a:graphic xmlns:a="http://schemas.openxmlformats.org/drawingml/2006/main">
+              <a:graphicData uri="http://schemas.openxmlformats.org/drawingml/2006/picture">
+                <pic:pic xmlns:pic="http://schemas.openxmlformats.org/drawingml/2006/picture">
+                  <pic:nvPicPr>
+                    <pic:cNvPr id="0" name="" descr=""/>
+                    <pic:cNvPicPr>
+                      <a:picLocks noChangeAspect="1" noChangeArrowheads="1"/>
+                    </pic:cNvPicPr>
+                  </pic:nvPicPr>
+                  <pic:blipFill>
+                    <a:blip r:embed="rId19" cstate="none"/>
+                    <a:srcRect/>
+                    <a:stretch>
+                      <a:fillRect/>
+                    </a:stretch>
+                  </pic:blipFill>
+                  <pic:spPr bwMode="auto">
+                    <a:xfrm>
+                      <a:off x="0" y="0"/>
+                      <a:ext cx="5210175" cy="3467100"/>
+                    </a:xfrm>
+                    <a:prstGeom prst="rect">
+                      <a:avLst/>
+                    </a:prstGeom>
+                  </pic:spPr>
+                </pic:pic>
+              </a:graphicData>
+            </a:graphic>
+          </wp:inline>
+        </w:drawing>
+      </w:r>
+    </w:p>
+    <w:p>
+      <w:pPr>
+        <w:spacing w:after="100" w:before="40" w:line="240" w:lineRule="auto"/>
+        <w:jc w:val="center"/>
+      </w:pPr>
+      <w:r>
+        <w:rPr>
+          <w:b/>
+          <w:bCs/>
+          <w:sz w:val="17"/>
+          <w:szCs w:val="17"/>
+        </w:rPr>
+        <w:t xml:space="preserve">Figure 5. </w:t>
+      </w:r>
+      <w:r>
+        <w:rPr>
+          <w:sz w:val="17"/>
+          <w:szCs w:val="17"/>
+        </w:rPr>
+        <w:t xml:space="preserve">Mobile view of the application, left to right: title, warning and Step 1 form; Step 1 result (Not sure, send for the Step 2 tests); Step 2 result (Not sure, refer to a specialist).</w:t>
+      </w:r>
+    </w:p>
     <w:p>
       <w:pPr>
         <w:pStyle w:val="Heading1"/>

</xml_diff>